<commit_message>
Add describe_starred.py and export_journal_docx.py; generate initial journal documents
Co-Authored-By: Claude Sonnet 4.6 <noreply@anthropic.com>
</commit_message>
<xml_diff>
--- a/docs/FIELD_JOURNAL_DEEP_ONLY.docx
+++ b/docs/FIELD_JOURNAL_DEEP_ONLY.docx
@@ -70,7 +70,11 @@
           <w:color w:val="444444"/>
           <w:sz w:val="20"/>
         </w:rPr>
-        <w:t>548 entries  ·  458 deep (≥ 0.7)  ·  87 shallow (0.5–0.7)</w:t>
+        <w:t>548 total entries</w:t>
+        <w:br/>
+        <w:t>458 deep (≥ 0.7)  ·  87 shallow (0.5–0.7)</w:t>
+        <w:br/>
+        <w:t>32 with descriptions  ·  32 starred</w:t>
         <w:br/>
         <w:t>Max desert depth: 0.9329</w:t>
       </w:r>
@@ -187,6 +191,33 @@
           <w:sz w:val="18"/>
         </w:rPr>
         <w:t>3rd nearest:   competent  (distance: 0.9579)</w:t>
+      </w:r>
+    </w:p>
+    <w:p>
+      <w:pPr>
+        <w:spacing w:before="2" w:after="2"/>
+        <w:ind w:left="283"/>
+      </w:pPr>
+      <w:r>
+        <w:rPr>
+          <w:i/>
+          <w:color w:val="333333"/>
+          <w:sz w:val="20"/>
+        </w:rPr>
+        <w:t>The capacity to maintain composure while exercising authority—a leader who remains unflappable under pressure, making decisive choices from a state of inner stillness rather than reactive agitation.</w:t>
+      </w:r>
+    </w:p>
+    <w:p>
+      <w:pPr>
+        <w:spacing w:before="1" w:after="2"/>
+      </w:pPr>
+      <w:r>
+        <w:rPr>
+          <w:b/>
+          <w:color w:val="FFD700"/>
+          <w:sz w:val="18"/>
+        </w:rPr>
+        <w:t xml:space="preserve">   ★ STARRED</w:t>
       </w:r>
     </w:p>
     <w:p>
@@ -286,6 +317,33 @@
     </w:p>
     <w:p>
       <w:pPr>
+        <w:spacing w:before="2" w:after="2"/>
+        <w:ind w:left="283"/>
+      </w:pPr>
+      <w:r>
+        <w:rPr>
+          <w:i/>
+          <w:color w:val="333333"/>
+          <w:sz w:val="20"/>
+        </w:rPr>
+        <w:t>This appears to be the fuzzy zone between **habitual emotional disposition** (the &amp;quot;usually&amp;quot; of feeling) and **sovereign affection** (thearchy&amp;#x27;s hierarchical love). The concept here might be: *a feeling that recurs so consistently it becomes constitutional to one&amp;#x27;s nature, neither chosen nor imposed but intrinsic*.</w:t>
+      </w:r>
+    </w:p>
+    <w:p>
+      <w:pPr>
+        <w:spacing w:before="1" w:after="2"/>
+      </w:pPr>
+      <w:r>
+        <w:rPr>
+          <w:b/>
+          <w:color w:val="FFD700"/>
+          <w:sz w:val="18"/>
+        </w:rPr>
+        <w:t xml:space="preserve">   ★ STARRED</w:t>
+      </w:r>
+    </w:p>
+    <w:p>
+      <w:pPr>
         <w:spacing w:before="4" w:after="4"/>
         <w:pBdr>
           <w:bottom w:val="single" w:sz="4" w:space="1" w:color="CCCCCC"/>
@@ -381,6 +439,33 @@
     </w:p>
     <w:p>
       <w:pPr>
+        <w:spacing w:before="2" w:after="2"/>
+        <w:ind w:left="283"/>
+      </w:pPr>
+      <w:r>
+        <w:rPr>
+          <w:i/>
+          <w:color w:val="333333"/>
+          <w:sz w:val="20"/>
+        </w:rPr>
+        <w:t>This is the moment when something passes from controlled custody into circulation—neither the act of giving it away (obtainment/issuing imply intentional transfer) nor the state of being free (released suggests finality), but the threshold act of relinquishing hold so it becomes accessible to others.</w:t>
+      </w:r>
+    </w:p>
+    <w:p>
+      <w:pPr>
+        <w:spacing w:before="1" w:after="2"/>
+      </w:pPr>
+      <w:r>
+        <w:rPr>
+          <w:b/>
+          <w:color w:val="FFD700"/>
+          <w:sz w:val="18"/>
+        </w:rPr>
+        <w:t xml:space="preserve">   ★ STARRED</w:t>
+      </w:r>
+    </w:p>
+    <w:p>
+      <w:pPr>
         <w:spacing w:before="4" w:after="4"/>
         <w:pBdr>
           <w:bottom w:val="single" w:sz="4" w:space="1" w:color="CCCCCC"/>
@@ -476,6 +561,33 @@
     </w:p>
     <w:p>
       <w:pPr>
+        <w:spacing w:before="2" w:after="2"/>
+        <w:ind w:left="283"/>
+      </w:pPr>
+      <w:r>
+        <w:rPr>
+          <w:i/>
+          <w:color w:val="333333"/>
+          <w:sz w:val="20"/>
+        </w:rPr>
+        <w:t>The act of displaying a weapon or hostile capability to coerce compliance without (yet) executing harm—the communicative threshold between possessing destructive power and using it. This is intimidation as a deliberate tool of will.</w:t>
+      </w:r>
+    </w:p>
+    <w:p>
+      <w:pPr>
+        <w:spacing w:before="1" w:after="2"/>
+      </w:pPr>
+      <w:r>
+        <w:rPr>
+          <w:b/>
+          <w:color w:val="FFD700"/>
+          <w:sz w:val="18"/>
+        </w:rPr>
+        <w:t xml:space="preserve">   ★ STARRED</w:t>
+      </w:r>
+    </w:p>
+    <w:p>
+      <w:pPr>
         <w:spacing w:before="4" w:after="4"/>
         <w:pBdr>
           <w:bottom w:val="single" w:sz="4" w:space="1" w:color="CCCCCC"/>
@@ -571,6 +683,33 @@
     </w:p>
     <w:p>
       <w:pPr>
+        <w:spacing w:before="2" w:after="2"/>
+        <w:ind w:left="283"/>
+      </w:pPr>
+      <w:r>
+        <w:rPr>
+          <w:i/>
+          <w:color w:val="333333"/>
+          <w:sz w:val="20"/>
+        </w:rPr>
+        <w:t>**Queued suspension**: The state of being held in a sequence where your turn hasn&amp;#x27;t arrived yet—neither actively processed nor abandoned, but temporarily sidelined pending resolution. It&amp;#x27;s the liminal position between a thing that follows something else and something situated in the middle of a process.</w:t>
+      </w:r>
+    </w:p>
+    <w:p>
+      <w:pPr>
+        <w:spacing w:before="1" w:after="2"/>
+      </w:pPr>
+      <w:r>
+        <w:rPr>
+          <w:b/>
+          <w:color w:val="FFD700"/>
+          <w:sz w:val="18"/>
+        </w:rPr>
+        <w:t xml:space="preserve">   ★ STARRED</w:t>
+      </w:r>
+    </w:p>
+    <w:p>
+      <w:pPr>
         <w:spacing w:before="4" w:after="4"/>
         <w:pBdr>
           <w:bottom w:val="single" w:sz="4" w:space="1" w:color="CCCCCC"/>
@@ -666,6 +805,33 @@
     </w:p>
     <w:p>
       <w:pPr>
+        <w:spacing w:before="2" w:after="2"/>
+        <w:ind w:left="283"/>
+      </w:pPr>
+      <w:r>
+        <w:rPr>
+          <w:i/>
+          <w:color w:val="333333"/>
+          <w:sz w:val="20"/>
+        </w:rPr>
+        <w:t>The social acknowledgment gesture that&amp;#x27;s too minimal or ambiguous to name—a half-wave, a mouth-twitch of recognition, or the micro-expression exchanged between strangers who almost collide. It&amp;#x27;s the threshold between deliberately communicating and accidentally signaling presence.</w:t>
+      </w:r>
+    </w:p>
+    <w:p>
+      <w:pPr>
+        <w:spacing w:before="1" w:after="2"/>
+      </w:pPr>
+      <w:r>
+        <w:rPr>
+          <w:b/>
+          <w:color w:val="FFD700"/>
+          <w:sz w:val="18"/>
+        </w:rPr>
+        <w:t xml:space="preserve">   ★ STARRED</w:t>
+      </w:r>
+    </w:p>
+    <w:p>
+      <w:pPr>
         <w:spacing w:before="4" w:after="4"/>
         <w:pBdr>
           <w:bottom w:val="single" w:sz="4" w:space="1" w:color="CCCCCC"/>
@@ -761,6 +927,33 @@
     </w:p>
     <w:p>
       <w:pPr>
+        <w:spacing w:before="2" w:after="2"/>
+        <w:ind w:left="283"/>
+      </w:pPr>
+      <w:r>
+        <w:rPr>
+          <w:i/>
+          <w:color w:val="333333"/>
+          <w:sz w:val="20"/>
+        </w:rPr>
+        <w:t>A state of heightened sexual arousal that clouds judgment without reaching full intoxication—the mental fog of desire that impairs rational thought while maintaining physical control. It&amp;#x27;s lust-induced distraction or preoccupation, where sexual fixation temporarily corrupts clear thinking.</w:t>
+      </w:r>
+    </w:p>
+    <w:p>
+      <w:pPr>
+        <w:spacing w:before="1" w:after="2"/>
+      </w:pPr>
+      <w:r>
+        <w:rPr>
+          <w:b/>
+          <w:color w:val="FFD700"/>
+          <w:sz w:val="18"/>
+        </w:rPr>
+        <w:t xml:space="preserve">   ★ STARRED</w:t>
+      </w:r>
+    </w:p>
+    <w:p>
+      <w:pPr>
         <w:spacing w:before="4" w:after="4"/>
         <w:pBdr>
           <w:bottom w:val="single" w:sz="4" w:space="1" w:color="CCCCCC"/>
@@ -856,6 +1049,33 @@
     </w:p>
     <w:p>
       <w:pPr>
+        <w:spacing w:before="2" w:after="2"/>
+        <w:ind w:left="283"/>
+      </w:pPr>
+      <w:r>
+        <w:rPr>
+          <w:i/>
+          <w:color w:val="333333"/>
+          <w:sz w:val="20"/>
+        </w:rPr>
+        <w:t>This space maps the dignity or prestige attached to a position or role—the honor of holding office itself, distinct from personal nobility or vanity. It&amp;#x27;s the structural esteem granted by institutional rank rather than moral character or appearance.</w:t>
+      </w:r>
+    </w:p>
+    <w:p>
+      <w:pPr>
+        <w:spacing w:before="1" w:after="2"/>
+      </w:pPr>
+      <w:r>
+        <w:rPr>
+          <w:b/>
+          <w:color w:val="FFD700"/>
+          <w:sz w:val="18"/>
+        </w:rPr>
+        <w:t xml:space="preserve">   ★ STARRED</w:t>
+      </w:r>
+    </w:p>
+    <w:p>
+      <w:pPr>
         <w:spacing w:before="4" w:after="4"/>
         <w:pBdr>
           <w:bottom w:val="single" w:sz="4" w:space="1" w:color="CCCCCC"/>
@@ -1141,6 +1361,33 @@
     </w:p>
     <w:p>
       <w:pPr>
+        <w:spacing w:before="2" w:after="2"/>
+        <w:ind w:left="283"/>
+      </w:pPr>
+      <w:r>
+        <w:rPr>
+          <w:i/>
+          <w:color w:val="333333"/>
+          <w:sz w:val="20"/>
+        </w:rPr>
+        <w:t>This point captures the experience of being **forced to move through opposing forces or constraints simultaneously**—the moment of committed transition where you must go *through* rather than around, accepting the friction of conflicting demands (like crossing a desert: spatial traversal that demands endurance against hostile conditions).</w:t>
+      </w:r>
+    </w:p>
+    <w:p>
+      <w:pPr>
+        <w:spacing w:before="1" w:after="2"/>
+      </w:pPr>
+      <w:r>
+        <w:rPr>
+          <w:b/>
+          <w:color w:val="FFD700"/>
+          <w:sz w:val="18"/>
+        </w:rPr>
+        <w:t xml:space="preserve">   ★ STARRED</w:t>
+      </w:r>
+    </w:p>
+    <w:p>
+      <w:pPr>
         <w:spacing w:before="4" w:after="4"/>
         <w:pBdr>
           <w:bottom w:val="single" w:sz="4" w:space="1" w:color="CCCCCC"/>
@@ -1236,6 +1483,33 @@
     </w:p>
     <w:p>
       <w:pPr>
+        <w:spacing w:before="2" w:after="2"/>
+        <w:ind w:left="283"/>
+      </w:pPr>
+      <w:r>
+        <w:rPr>
+          <w:i/>
+          <w:color w:val="333333"/>
+          <w:sz w:val="20"/>
+        </w:rPr>
+        <w:t>The concept of **configuration** or **disposition**—the specific way something is spatially or structurally positioned, distinct from the act of arranging it or the abstract manner of doing so. This is the state of being disposed, the actual layout itself rather than the process or style.</w:t>
+      </w:r>
+    </w:p>
+    <w:p>
+      <w:pPr>
+        <w:spacing w:before="1" w:after="2"/>
+      </w:pPr>
+      <w:r>
+        <w:rPr>
+          <w:b/>
+          <w:color w:val="FFD700"/>
+          <w:sz w:val="18"/>
+        </w:rPr>
+        <w:t xml:space="preserve">   ★ STARRED</w:t>
+      </w:r>
+    </w:p>
+    <w:p>
+      <w:pPr>
         <w:spacing w:before="4" w:after="4"/>
         <w:pBdr>
           <w:bottom w:val="single" w:sz="4" w:space="1" w:color="CCCCCC"/>
@@ -1331,6 +1605,33 @@
     </w:p>
     <w:p>
       <w:pPr>
+        <w:spacing w:before="2" w:after="2"/>
+        <w:ind w:left="283"/>
+      </w:pPr>
+      <w:r>
+        <w:rPr>
+          <w:i/>
+          <w:color w:val="333333"/>
+          <w:sz w:val="20"/>
+        </w:rPr>
+        <w:t>The state of being materially dependent on another&amp;#x27;s continued favor or patronage—sustained submissiveness that requires constant performance of loyalty to preserve one&amp;#x27;s position or livelihood.</w:t>
+      </w:r>
+    </w:p>
+    <w:p>
+      <w:pPr>
+        <w:spacing w:before="1" w:after="2"/>
+      </w:pPr>
+      <w:r>
+        <w:rPr>
+          <w:b/>
+          <w:color w:val="FFD700"/>
+          <w:sz w:val="18"/>
+        </w:rPr>
+        <w:t xml:space="preserve">   ★ STARRED</w:t>
+      </w:r>
+    </w:p>
+    <w:p>
+      <w:pPr>
         <w:spacing w:before="4" w:after="4"/>
         <w:pBdr>
           <w:bottom w:val="single" w:sz="4" w:space="1" w:color="CCCCCC"/>
@@ -1426,6 +1727,33 @@
     </w:p>
     <w:p>
       <w:pPr>
+        <w:spacing w:before="2" w:after="2"/>
+        <w:ind w:left="283"/>
+      </w:pPr>
+      <w:r>
+        <w:rPr>
+          <w:i/>
+          <w:color w:val="333333"/>
+          <w:sz w:val="20"/>
+        </w:rPr>
+        <w:t>This is the space where **evidence becomes assertion**—the moment when observed facts or demonstrated proof gets spoken aloud as a claim demanding belief, rather than remaining mere data. It&amp;#x27;s testimony without the courtroom formality; demonstration that&amp;#x27;s been verbalized into persuasion.</w:t>
+      </w:r>
+    </w:p>
+    <w:p>
+      <w:pPr>
+        <w:spacing w:before="1" w:after="2"/>
+      </w:pPr>
+      <w:r>
+        <w:rPr>
+          <w:b/>
+          <w:color w:val="FFD700"/>
+          <w:sz w:val="18"/>
+        </w:rPr>
+        <w:t xml:space="preserve">   ★ STARRED</w:t>
+      </w:r>
+    </w:p>
+    <w:p>
+      <w:pPr>
         <w:spacing w:before="4" w:after="4"/>
         <w:pBdr>
           <w:bottom w:val="single" w:sz="4" w:space="1" w:color="CCCCCC"/>
@@ -1521,6 +1849,33 @@
     </w:p>
     <w:p>
       <w:pPr>
+        <w:spacing w:before="2" w:after="2"/>
+        <w:ind w:left="283"/>
+      </w:pPr>
+      <w:r>
+        <w:rPr>
+          <w:i/>
+          <w:color w:val="333333"/>
+          <w:sz w:val="20"/>
+        </w:rPr>
+        <w:t>This region captures **comprehensive scope with upward directionality**—the quality of something being both all-encompassing and elevated or superior in application, like &amp;quot;across the board at a higher level&amp;quot; or the sense that a rule applies universally *and* transcends particular cases.</w:t>
+      </w:r>
+    </w:p>
+    <w:p>
+      <w:pPr>
+        <w:spacing w:before="1" w:after="2"/>
+      </w:pPr>
+      <w:r>
+        <w:rPr>
+          <w:b/>
+          <w:color w:val="FFD700"/>
+          <w:sz w:val="18"/>
+        </w:rPr>
+        <w:t xml:space="preserve">   ★ STARRED</w:t>
+      </w:r>
+    </w:p>
+    <w:p>
+      <w:pPr>
         <w:spacing w:before="4" w:after="4"/>
         <w:pBdr>
           <w:bottom w:val="single" w:sz="4" w:space="1" w:color="CCCCCC"/>
@@ -1616,6 +1971,33 @@
     </w:p>
     <w:p>
       <w:pPr>
+        <w:spacing w:before="2" w:after="2"/>
+        <w:ind w:left="283"/>
+      </w:pPr>
+      <w:r>
+        <w:rPr>
+          <w:i/>
+          <w:color w:val="333333"/>
+          <w:sz w:val="20"/>
+        </w:rPr>
+        <w:t>**Soft wealth** — a luxury good that is both materially refined (silk&amp;#x27;s smoothness) and economically valuable (cash&amp;#x27;s purchasing power), occupying the space where desirability as material meets desirability as tradeable asset.</w:t>
+      </w:r>
+    </w:p>
+    <w:p>
+      <w:pPr>
+        <w:spacing w:before="1" w:after="2"/>
+      </w:pPr>
+      <w:r>
+        <w:rPr>
+          <w:b/>
+          <w:color w:val="FFD700"/>
+          <w:sz w:val="18"/>
+        </w:rPr>
+        <w:t xml:space="preserve">   ★ STARRED</w:t>
+      </w:r>
+    </w:p>
+    <w:p>
+      <w:pPr>
         <w:spacing w:before="4" w:after="4"/>
         <w:pBdr>
           <w:bottom w:val="single" w:sz="4" w:space="1" w:color="CCCCCC"/>
@@ -1711,6 +2093,33 @@
     </w:p>
     <w:p>
       <w:pPr>
+        <w:spacing w:before="2" w:after="2"/>
+        <w:ind w:left="283"/>
+      </w:pPr>
+      <w:r>
+        <w:rPr>
+          <w:i/>
+          <w:color w:val="333333"/>
+          <w:sz w:val="20"/>
+        </w:rPr>
+        <w:t>The obligation to govern a territory or people you are responsible for—the binding weight of stewardship rather than mere authority. It&amp;#x27;s duty crystallized into territorial form, where your power and your accountability occupy the same space.</w:t>
+      </w:r>
+    </w:p>
+    <w:p>
+      <w:pPr>
+        <w:spacing w:before="1" w:after="2"/>
+      </w:pPr>
+      <w:r>
+        <w:rPr>
+          <w:b/>
+          <w:color w:val="FFD700"/>
+          <w:sz w:val="18"/>
+        </w:rPr>
+        <w:t xml:space="preserve">   ★ STARRED</w:t>
+      </w:r>
+    </w:p>
+    <w:p>
+      <w:pPr>
         <w:spacing w:before="4" w:after="4"/>
         <w:pBdr>
           <w:bottom w:val="single" w:sz="4" w:space="1" w:color="CCCCCC"/>
@@ -1806,6 +2215,33 @@
     </w:p>
     <w:p>
       <w:pPr>
+        <w:spacing w:before="2" w:after="2"/>
+        <w:ind w:left="283"/>
+      </w:pPr>
+      <w:r>
+        <w:rPr>
+          <w:i/>
+          <w:color w:val="333333"/>
+          <w:sz w:val="20"/>
+        </w:rPr>
+        <w:t>The concept of **territorial dominion without legitimate authority**—a space where power is exercised over a region but the right to do so is contested or absent, as in occupation, usurpation, or colonization.</w:t>
+      </w:r>
+    </w:p>
+    <w:p>
+      <w:pPr>
+        <w:spacing w:before="1" w:after="2"/>
+      </w:pPr>
+      <w:r>
+        <w:rPr>
+          <w:b/>
+          <w:color w:val="FFD700"/>
+          <w:sz w:val="18"/>
+        </w:rPr>
+        <w:t xml:space="preserve">   ★ STARRED</w:t>
+      </w:r>
+    </w:p>
+    <w:p>
+      <w:pPr>
         <w:spacing w:before="4" w:after="4"/>
         <w:pBdr>
           <w:bottom w:val="single" w:sz="4" w:space="1" w:color="CCCCCC"/>
@@ -1901,6 +2337,33 @@
     </w:p>
     <w:p>
       <w:pPr>
+        <w:spacing w:before="2" w:after="2"/>
+        <w:ind w:left="283"/>
+      </w:pPr>
+      <w:r>
+        <w:rPr>
+          <w:i/>
+          <w:color w:val="333333"/>
+          <w:sz w:val="20"/>
+        </w:rPr>
+        <w:t>A quality of obscured visibility or muffled perception—something that blocks clear sight or sound without being dense enough to be called shade, like fog filtering light or undergrowth dampening noise.</w:t>
+      </w:r>
+    </w:p>
+    <w:p>
+      <w:pPr>
+        <w:spacing w:before="1" w:after="2"/>
+      </w:pPr>
+      <w:r>
+        <w:rPr>
+          <w:b/>
+          <w:color w:val="FFD700"/>
+          <w:sz w:val="18"/>
+        </w:rPr>
+        <w:t xml:space="preserve">   ★ STARRED</w:t>
+      </w:r>
+    </w:p>
+    <w:p>
+      <w:pPr>
         <w:spacing w:before="4" w:after="4"/>
         <w:pBdr>
           <w:bottom w:val="single" w:sz="4" w:space="1" w:color="CCCCCC"/>
@@ -1996,6 +2459,33 @@
     </w:p>
     <w:p>
       <w:pPr>
+        <w:spacing w:before="2" w:after="2"/>
+        <w:ind w:left="283"/>
+      </w:pPr>
+      <w:r>
+        <w:rPr>
+          <w:i/>
+          <w:color w:val="333333"/>
+          <w:sz w:val="20"/>
+        </w:rPr>
+        <w:t>This space maps the boundary between **formlessness acquiring structure** and **constraint shaping potential**—the zone where something initially undefined begins accepting definition through external pressure or pattern. It&amp;#x27;s the moment of *being formed rather than forming*, distinct from both the abstract concept of quantum indeterminacy and the concrete process of molding itself.</w:t>
+      </w:r>
+    </w:p>
+    <w:p>
+      <w:pPr>
+        <w:spacing w:before="1" w:after="2"/>
+      </w:pPr>
+      <w:r>
+        <w:rPr>
+          <w:b/>
+          <w:color w:val="FFD700"/>
+          <w:sz w:val="18"/>
+        </w:rPr>
+        <w:t xml:space="preserve">   ★ STARRED</w:t>
+      </w:r>
+    </w:p>
+    <w:p>
+      <w:pPr>
         <w:spacing w:before="4" w:after="4"/>
         <w:pBdr>
           <w:bottom w:val="single" w:sz="4" w:space="1" w:color="CCCCCC"/>
@@ -2091,6 +2581,33 @@
     </w:p>
     <w:p>
       <w:pPr>
+        <w:spacing w:before="2" w:after="2"/>
+        <w:ind w:left="283"/>
+      </w:pPr>
+      <w:r>
+        <w:rPr>
+          <w:i/>
+          <w:color w:val="333333"/>
+          <w:sz w:val="20"/>
+        </w:rPr>
+        <w:t>This space captures **claimed authority through personal avowal**—asserting something as true or binding based on one&amp;#x27;s own word or experience rather than external evidence, combining testimony&amp;#x27;s evidential weight with animo&amp;#x27;s willful assertion and sanctimony&amp;#x27;s performative conviction. It&amp;#x27;s the gap where self-report becomes self-authorization.</w:t>
+      </w:r>
+    </w:p>
+    <w:p>
+      <w:pPr>
+        <w:spacing w:before="1" w:after="2"/>
+      </w:pPr>
+      <w:r>
+        <w:rPr>
+          <w:b/>
+          <w:color w:val="FFD700"/>
+          <w:sz w:val="18"/>
+        </w:rPr>
+        <w:t xml:space="preserve">   ★ STARRED</w:t>
+      </w:r>
+    </w:p>
+    <w:p>
+      <w:pPr>
         <w:spacing w:before="4" w:after="4"/>
         <w:pBdr>
           <w:bottom w:val="single" w:sz="4" w:space="1" w:color="CCCCCC"/>
@@ -2186,6 +2703,33 @@
     </w:p>
     <w:p>
       <w:pPr>
+        <w:spacing w:before="2" w:after="2"/>
+        <w:ind w:left="283"/>
+      </w:pPr>
+      <w:r>
+        <w:rPr>
+          <w:i/>
+          <w:color w:val="333333"/>
+          <w:sz w:val="20"/>
+        </w:rPr>
+        <w:t>**Lexical compression**: the deliberate choice of fewer, denser words that carry maximum semantic weight—saying &amp;quot;taciturn&amp;quot; instead of &amp;quot;doesn&amp;#x27;t talk much.&amp;quot; It&amp;#x27;s conciseness achieved through vocabulary precision rather than mere brevity.</w:t>
+      </w:r>
+    </w:p>
+    <w:p>
+      <w:pPr>
+        <w:spacing w:before="1" w:after="2"/>
+      </w:pPr>
+      <w:r>
+        <w:rPr>
+          <w:b/>
+          <w:color w:val="FFD700"/>
+          <w:sz w:val="18"/>
+        </w:rPr>
+        <w:t xml:space="preserve">   ★ STARRED</w:t>
+      </w:r>
+    </w:p>
+    <w:p>
+      <w:pPr>
         <w:spacing w:before="4" w:after="4"/>
         <w:pBdr>
           <w:bottom w:val="single" w:sz="4" w:space="1" w:color="CCCCCC"/>
@@ -2281,6 +2825,33 @@
     </w:p>
     <w:p>
       <w:pPr>
+        <w:spacing w:before="2" w:after="2"/>
+        <w:ind w:left="283"/>
+      </w:pPr>
+      <w:r>
+        <w:rPr>
+          <w:i/>
+          <w:color w:val="333333"/>
+          <w:sz w:val="20"/>
+        </w:rPr>
+        <w:t>This point occupies the space between **meaning-as-reference** (what words point to) and **meaning-as-relation** (how words connect to each other). It&amp;#x27;s the concept of meaning that emerges from *both* the thing itself *and* its position in a network of associations—neither pure semantics nor pure lexical structure, but their friction point.</w:t>
+      </w:r>
+    </w:p>
+    <w:p>
+      <w:pPr>
+        <w:spacing w:before="1" w:after="2"/>
+      </w:pPr>
+      <w:r>
+        <w:rPr>
+          <w:b/>
+          <w:color w:val="FFD700"/>
+          <w:sz w:val="18"/>
+        </w:rPr>
+        <w:t xml:space="preserve">   ★ STARRED</w:t>
+      </w:r>
+    </w:p>
+    <w:p>
+      <w:pPr>
         <w:spacing w:before="4" w:after="4"/>
         <w:pBdr>
           <w:bottom w:val="single" w:sz="4" w:space="1" w:color="CCCCCC"/>
@@ -2376,6 +2947,33 @@
     </w:p>
     <w:p>
       <w:pPr>
+        <w:spacing w:before="2" w:after="2"/>
+        <w:ind w:left="283"/>
+      </w:pPr>
+      <w:r>
+        <w:rPr>
+          <w:i/>
+          <w:color w:val="333333"/>
+          <w:sz w:val="20"/>
+        </w:rPr>
+        <w:t>**Expanse without subdivision** — a continuous stretch of space or material that lacks internal divisions or boundaries, where extent matters more than any structured organization within it.</w:t>
+      </w:r>
+    </w:p>
+    <w:p>
+      <w:pPr>
+        <w:spacing w:before="1" w:after="2"/>
+      </w:pPr>
+      <w:r>
+        <w:rPr>
+          <w:b/>
+          <w:color w:val="FFD700"/>
+          <w:sz w:val="18"/>
+        </w:rPr>
+        <w:t xml:space="preserve">   ★ STARRED</w:t>
+      </w:r>
+    </w:p>
+    <w:p>
+      <w:pPr>
         <w:spacing w:before="4" w:after="4"/>
         <w:pBdr>
           <w:bottom w:val="single" w:sz="4" w:space="1" w:color="CCCCCC"/>
@@ -2471,6 +3069,33 @@
     </w:p>
     <w:p>
       <w:pPr>
+        <w:spacing w:before="2" w:after="2"/>
+        <w:ind w:left="283"/>
+      </w:pPr>
+      <w:r>
+        <w:rPr>
+          <w:i/>
+          <w:color w:val="333333"/>
+          <w:sz w:val="20"/>
+        </w:rPr>
+        <w:t>This space captures the **sensory residue of consumed experience**—what remains perceptually present after something has passed through you, neither fully internalized knowledge (noemata) nor expelled waste (egesta), but the lingering flavor-memory or stain left behind (annatto&amp;#x27;s coloring function). It&amp;#x27;s the ghost-trace of interaction: what your senses retain when the object itself is gone.</w:t>
+      </w:r>
+    </w:p>
+    <w:p>
+      <w:pPr>
+        <w:spacing w:before="1" w:after="2"/>
+      </w:pPr>
+      <w:r>
+        <w:rPr>
+          <w:b/>
+          <w:color w:val="FFD700"/>
+          <w:sz w:val="18"/>
+        </w:rPr>
+        <w:t xml:space="preserve">   ★ STARRED</w:t>
+      </w:r>
+    </w:p>
+    <w:p>
+      <w:pPr>
         <w:spacing w:before="4" w:after="4"/>
         <w:pBdr>
           <w:bottom w:val="single" w:sz="4" w:space="1" w:color="CCCCCC"/>
@@ -2661,6 +3286,33 @@
     </w:p>
     <w:p>
       <w:pPr>
+        <w:spacing w:before="2" w:after="2"/>
+        <w:ind w:left="283"/>
+      </w:pPr>
+      <w:r>
+        <w:rPr>
+          <w:i/>
+          <w:color w:val="333333"/>
+          <w:sz w:val="20"/>
+        </w:rPr>
+        <w:t>**Combative intellect**: intellectual engagement driven by competitive assertion rather than truth-seeking or wisdom—the mind deployed as a weapon to dominate, prove superiority, or overcome opposition rather than understand.</w:t>
+      </w:r>
+    </w:p>
+    <w:p>
+      <w:pPr>
+        <w:spacing w:before="1" w:after="2"/>
+      </w:pPr>
+      <w:r>
+        <w:rPr>
+          <w:b/>
+          <w:color w:val="FFD700"/>
+          <w:sz w:val="18"/>
+        </w:rPr>
+        <w:t xml:space="preserve">   ★ STARRED</w:t>
+      </w:r>
+    </w:p>
+    <w:p>
+      <w:pPr>
         <w:spacing w:before="4" w:after="4"/>
         <w:pBdr>
           <w:bottom w:val="single" w:sz="4" w:space="1" w:color="CCCCCC"/>
@@ -2756,6 +3408,33 @@
     </w:p>
     <w:p>
       <w:pPr>
+        <w:spacing w:before="2" w:after="2"/>
+        <w:ind w:left="283"/>
+      </w:pPr>
+      <w:r>
+        <w:rPr>
+          <w:i/>
+          <w:color w:val="333333"/>
+          <w:sz w:val="20"/>
+        </w:rPr>
+        <w:t>This is the act of imagining a radically different framework or system that doesn&amp;#x27;t yet exist—holding a vision of alternative possibilities while actively thinking through its implications. It&amp;#x27;s the conceptual space where abstract rethinking meets concrete envisioning.</w:t>
+      </w:r>
+    </w:p>
+    <w:p>
+      <w:pPr>
+        <w:spacing w:before="1" w:after="2"/>
+      </w:pPr>
+      <w:r>
+        <w:rPr>
+          <w:b/>
+          <w:color w:val="FFD700"/>
+          <w:sz w:val="18"/>
+        </w:rPr>
+        <w:t xml:space="preserve">   ★ STARRED</w:t>
+      </w:r>
+    </w:p>
+    <w:p>
+      <w:pPr>
         <w:spacing w:before="4" w:after="4"/>
         <w:pBdr>
           <w:bottom w:val="single" w:sz="4" w:space="1" w:color="CCCCCC"/>
@@ -2851,6 +3530,33 @@
     </w:p>
     <w:p>
       <w:pPr>
+        <w:spacing w:before="2" w:after="2"/>
+        <w:ind w:left="283"/>
+      </w:pPr>
+      <w:r>
+        <w:rPr>
+          <w:i/>
+          <w:color w:val="333333"/>
+          <w:sz w:val="20"/>
+        </w:rPr>
+        <w:t>The passive experiencing of something objectionable—noticing foul air or a bad smell without acting on it, the way a bystander registers an unpleasant fact.</w:t>
+      </w:r>
+    </w:p>
+    <w:p>
+      <w:pPr>
+        <w:spacing w:before="1" w:after="2"/>
+      </w:pPr>
+      <w:r>
+        <w:rPr>
+          <w:b/>
+          <w:color w:val="FFD700"/>
+          <w:sz w:val="18"/>
+        </w:rPr>
+        <w:t xml:space="preserve">   ★ STARRED</w:t>
+      </w:r>
+    </w:p>
+    <w:p>
+      <w:pPr>
         <w:spacing w:before="4" w:after="4"/>
         <w:pBdr>
           <w:bottom w:val="single" w:sz="4" w:space="1" w:color="CCCCCC"/>
@@ -2946,6 +3652,33 @@
     </w:p>
     <w:p>
       <w:pPr>
+        <w:spacing w:before="2" w:after="2"/>
+        <w:ind w:left="283"/>
+      </w:pPr>
+      <w:r>
+        <w:rPr>
+          <w:i/>
+          <w:color w:val="333333"/>
+          <w:sz w:val="20"/>
+        </w:rPr>
+        <w:t>The state of using alcohol to bolster one&amp;#x27;s ego or self-regard—intoxication that loosens self-criticism and permits self-aggrandizing thoughts. It&amp;#x27;s drunken vanity, where lowered inhibitions merge with inflated self-perception.</w:t>
+      </w:r>
+    </w:p>
+    <w:p>
+      <w:pPr>
+        <w:spacing w:before="1" w:after="2"/>
+      </w:pPr>
+      <w:r>
+        <w:rPr>
+          <w:b/>
+          <w:color w:val="FFD700"/>
+          <w:sz w:val="18"/>
+        </w:rPr>
+        <w:t xml:space="preserve">   ★ STARRED</w:t>
+      </w:r>
+    </w:p>
+    <w:p>
+      <w:pPr>
         <w:spacing w:before="4" w:after="4"/>
         <w:pBdr>
           <w:bottom w:val="single" w:sz="4" w:space="1" w:color="CCCCCC"/>
@@ -3041,6 +3774,33 @@
     </w:p>
     <w:p>
       <w:pPr>
+        <w:spacing w:before="2" w:after="2"/>
+        <w:ind w:left="283"/>
+      </w:pPr>
+      <w:r>
+        <w:rPr>
+          <w:i/>
+          <w:color w:val="333333"/>
+          <w:sz w:val="20"/>
+        </w:rPr>
+        <w:t>This is **bearing or deportment**—the physical and social presentation of oneself through bodily comportment, facial expression, and demeanor that communicates status, mood, or intention to others. It&amp;#x27;s the observable interface where a person&amp;#x27;s internal state and social intentions manifest through their body.</w:t>
+      </w:r>
+    </w:p>
+    <w:p>
+      <w:pPr>
+        <w:spacing w:before="1" w:after="2"/>
+      </w:pPr>
+      <w:r>
+        <w:rPr>
+          <w:b/>
+          <w:color w:val="FFD700"/>
+          <w:sz w:val="18"/>
+        </w:rPr>
+        <w:t xml:space="preserve">   ★ STARRED</w:t>
+      </w:r>
+    </w:p>
+    <w:p>
+      <w:pPr>
         <w:spacing w:before="4" w:after="4"/>
         <w:pBdr>
           <w:bottom w:val="single" w:sz="4" w:space="1" w:color="CCCCCC"/>
@@ -3136,6 +3896,33 @@
     </w:p>
     <w:p>
       <w:pPr>
+        <w:spacing w:before="2" w:after="2"/>
+        <w:ind w:left="283"/>
+      </w:pPr>
+      <w:r>
+        <w:rPr>
+          <w:i/>
+          <w:color w:val="333333"/>
+          <w:sz w:val="20"/>
+        </w:rPr>
+        <w:t>This space captures **provisional action taken under uncertainty**—acting despite unresolved doubts, where you proceed because waiting costs more than the risk of being wrong. It&amp;#x27;s the stance of someone who questions but doesn&amp;#x27;t paralyze, who doubts but moves anyway.</w:t>
+      </w:r>
+    </w:p>
+    <w:p>
+      <w:pPr>
+        <w:spacing w:before="1" w:after="2"/>
+      </w:pPr>
+      <w:r>
+        <w:rPr>
+          <w:b/>
+          <w:color w:val="FFD700"/>
+          <w:sz w:val="18"/>
+        </w:rPr>
+        <w:t xml:space="preserve">   ★ STARRED</w:t>
+      </w:r>
+    </w:p>
+    <w:p>
+      <w:pPr>
         <w:spacing w:before="4" w:after="4"/>
         <w:pBdr>
           <w:bottom w:val="single" w:sz="4" w:space="1" w:color="CCCCCC"/>
@@ -3326,6 +4113,33 @@
     </w:p>
     <w:p>
       <w:pPr>
+        <w:spacing w:before="2" w:after="2"/>
+        <w:ind w:left="283"/>
+      </w:pPr>
+      <w:r>
+        <w:rPr>
+          <w:i/>
+          <w:color w:val="333333"/>
+          <w:sz w:val="20"/>
+        </w:rPr>
+        <w:t>**Prepared performance**: The act of delivering pre-learned material with controlled expression, where intellectual mastery and stylistic choices merge—neither raw recitation nor full improvisation, but practiced rendition shaped by rehearsed interpretation.</w:t>
+      </w:r>
+    </w:p>
+    <w:p>
+      <w:pPr>
+        <w:spacing w:before="1" w:after="2"/>
+      </w:pPr>
+      <w:r>
+        <w:rPr>
+          <w:b/>
+          <w:color w:val="FFD700"/>
+          <w:sz w:val="18"/>
+        </w:rPr>
+        <w:t xml:space="preserve">   ★ STARRED</w:t>
+      </w:r>
+    </w:p>
+    <w:p>
+      <w:pPr>
         <w:spacing w:before="4" w:after="4"/>
         <w:pBdr>
           <w:bottom w:val="single" w:sz="4" w:space="1" w:color="CCCCCC"/>
@@ -3611,6 +4425,33 @@
     </w:p>
     <w:p>
       <w:pPr>
+        <w:spacing w:before="2" w:after="2"/>
+        <w:ind w:left="283"/>
+      </w:pPr>
+      <w:r>
+        <w:rPr>
+          <w:i/>
+          <w:color w:val="333333"/>
+          <w:sz w:val="20"/>
+        </w:rPr>
+        <w:t>A fortified refuge in harsh terrain—a place made defensible by its own inhospitable geography, where survival itself requires both isolation and active maintenance of boundaries.</w:t>
+      </w:r>
+    </w:p>
+    <w:p>
+      <w:pPr>
+        <w:spacing w:before="1" w:after="2"/>
+      </w:pPr>
+      <w:r>
+        <w:rPr>
+          <w:b/>
+          <w:color w:val="FFD700"/>
+          <w:sz w:val="18"/>
+        </w:rPr>
+        <w:t xml:space="preserve">   ★ STARRED</w:t>
+      </w:r>
+    </w:p>
+    <w:p>
+      <w:pPr>
         <w:spacing w:before="4" w:after="4"/>
         <w:pBdr>
           <w:bottom w:val="single" w:sz="4" w:space="1" w:color="CCCCCC"/>
@@ -3702,6 +4543,33 @@
           <w:sz w:val="18"/>
         </w:rPr>
         <w:t>3rd nearest:   over  (distance: 0.9094)</w:t>
+      </w:r>
+    </w:p>
+    <w:p>
+      <w:pPr>
+        <w:spacing w:before="2" w:after="2"/>
+        <w:ind w:left="283"/>
+      </w:pPr>
+      <w:r>
+        <w:rPr>
+          <w:i/>
+          <w:color w:val="333333"/>
+          <w:sz w:val="20"/>
+        </w:rPr>
+        <w:t>This point captures **exceeding natural limits through dominance**—when something physically encroaches beyond its proper bounds (overgrowth) while simultaneously asserting authority to do so (overruling). It&amp;#x27;s the concept of aggressive expansion that justifies itself.</w:t>
+      </w:r>
+    </w:p>
+    <w:p>
+      <w:pPr>
+        <w:spacing w:before="1" w:after="2"/>
+      </w:pPr>
+      <w:r>
+        <w:rPr>
+          <w:b/>
+          <w:color w:val="FFD700"/>
+          <w:sz w:val="18"/>
+        </w:rPr>
+        <w:t xml:space="preserve">   ★ STARRED</w:t>
       </w:r>
     </w:p>
     <w:p>

</xml_diff>